<commit_message>
docs: Expand to 10 highly realistic academic faculty mock resumes for local verification
</commit_message>
<xml_diff>
--- a/backend/tests/mock_resumes/dr_amit_patel_manual_review.docx
+++ b/backend/tests/mock_resumes/dr_amit_patel_manual_review.docx
@@ -15,7 +15,7 @@
         <w:pStyle w:val="Heading1"/>
       </w:pPr>
       <w:r>
-        <w:t>Personal Details</w:t>
+        <w:t>Contact Details</w:t>
       </w:r>
     </w:p>
     <w:p>
@@ -30,7 +30,7 @@
     </w:p>
     <w:p>
       <w:r>
-        <w:t>Address: Hyderabad, India</w:t>
+        <w:t>Address: Gachibowli, Hyderabad, Telangana, India</w:t>
       </w:r>
     </w:p>
     <w:p>
@@ -56,12 +56,17 @@
         <w:pStyle w:val="Heading1"/>
       </w:pPr>
       <w:r>
-        <w:t>Work Experience</w:t>
+        <w:t>Professional Experience</w:t>
       </w:r>
     </w:p>
     <w:p>
       <w:r>
-        <w:t>Senior Researcher at TCS Innovation Labs (2020 - Present)</w:t>
+        <w:t>Senior Researcher, AI &amp; Analytics Group, TCS Innovation Labs (2020 - Present)</w:t>
+      </w:r>
+    </w:p>
+    <w:p>
+      <w:r>
+        <w:t>Research Scholar, Computer Science Department, NIT Warangal (2015 - 2020)</w:t>
       </w:r>
     </w:p>
     <w:sectPr>

</xml_diff>